<commit_message>
fix: memperbaiki halaman surat untuk semua role
</commit_message>
<xml_diff>
--- a/storage/templates/pengajuan-budget-operational-2.docx
+++ b/storage/templates/pengajuan-budget-operational-2.docx
@@ -1,6 +1,6 @@
 
 <file path=word/document.xml><?xml version="1.0" encoding="utf-8"?>
-<w:document xmlns:wpc="http://schemas.microsoft.com/office/word/2010/wordprocessingCanvas" xmlns:cx="http://schemas.microsoft.com/office/drawing/2014/chartex" xmlns:cx1="http://schemas.microsoft.com/office/drawing/2015/9/8/chartex" xmlns:cx2="http://schemas.microsoft.com/office/drawing/2015/10/21/chartex" xmlns:cx3="http://schemas.microsoft.com/office/drawing/2016/5/9/chartex" xmlns:cx4="http://schemas.microsoft.com/office/drawing/2016/5/10/chartex" xmlns:cx5="http://schemas.microsoft.com/office/drawing/2016/5/11/chartex" xmlns:cx6="http://schemas.microsoft.com/office/drawing/2016/5/12/chartex" xmlns:cx7="http://schemas.microsoft.com/office/drawing/2016/5/13/chartex" xmlns:cx8="http://schemas.microsoft.com/office/drawing/2016/5/14/chartex" xmlns:mc="http://schemas.openxmlformats.org/markup-compatibility/2006" xmlns:aink="http://schemas.microsoft.com/office/drawing/2016/ink" xmlns:am3d="http://schemas.microsoft.com/office/drawing/2017/model3d" xmlns:o="urn:schemas-microsoft-com:office:office" xmlns:oel="http://schemas.microsoft.com/office/2019/extlst" xmlns:r="http://schemas.openxmlformats.org/officeDocument/2006/relationships" xmlns:m="http://schemas.openxmlformats.org/officeDocument/2006/math" xmlns:v="urn:schemas-microsoft-com:vml" xmlns:wp14="http://schemas.microsoft.com/office/word/2010/wordprocessingDrawing" xmlns:wp="http://schemas.openxmlformats.org/drawingml/2006/wordprocessingDrawing" xmlns:w10="urn:schemas-microsoft-com:office:word" xmlns:w="http://schemas.openxmlformats.org/wordprocessingml/2006/main" xmlns:w14="http://schemas.microsoft.com/office/word/2010/wordml" xmlns:w15="http://schemas.microsoft.com/office/word/2012/wordml" xmlns:w16cex="http://schemas.microsoft.com/office/word/2018/wordml/cex" xmlns:w16cid="http://schemas.microsoft.com/office/word/2016/wordml/cid" xmlns:w16="http://schemas.microsoft.com/office/word/2018/wordml" xmlns:w16du="http://schemas.microsoft.com/office/word/2023/wordml/word16du" xmlns:w16sdtdh="http://schemas.microsoft.com/office/word/2020/wordml/sdtdatahash" xmlns:w16sdtfl="http://schemas.microsoft.com/office/word/2024/wordml/sdtformatlock" xmlns:w16se="http://schemas.microsoft.com/office/word/2015/wordml/symex" xmlns:wpg="http://schemas.microsoft.com/office/word/2010/wordprocessingGroup" xmlns:wpi="http://schemas.microsoft.com/office/word/2010/wordprocessingInk" xmlns:wne="http://schemas.microsoft.com/office/word/2006/wordml" xmlns:wps="http://schemas.microsoft.com/office/word/2010/wordprocessingShape" mc:Ignorable="w14 w15 w16se w16cid w16 w16cex w16sdtdh w16sdtfl w16du wp14">
+<w:document xmlns:wpc="http://schemas.microsoft.com/office/word/2010/wordprocessingCanvas" xmlns:cx="http://schemas.microsoft.com/office/drawing/2014/chartex" xmlns:cx1="http://schemas.microsoft.com/office/drawing/2015/9/8/chartex" xmlns:cx2="http://schemas.microsoft.com/office/drawing/2015/10/21/chartex" xmlns:cx3="http://schemas.microsoft.com/office/drawing/2016/5/9/chartex" xmlns:cx4="http://schemas.microsoft.com/office/drawing/2016/5/10/chartex" xmlns:cx5="http://schemas.microsoft.com/office/drawing/2016/5/11/chartex" xmlns:cx6="http://schemas.microsoft.com/office/drawing/2016/5/12/chartex" xmlns:cx7="http://schemas.microsoft.com/office/drawing/2016/5/13/chartex" xmlns:cx8="http://schemas.microsoft.com/office/drawing/2016/5/14/chartex" xmlns:mc="http://schemas.openxmlformats.org/markup-compatibility/2006" xmlns:aink="http://schemas.microsoft.com/office/drawing/2016/ink" xmlns:am3d="http://schemas.microsoft.com/office/drawing/2017/model3d" xmlns:o="urn:schemas-microsoft-com:office:office" xmlns:oel="http://schemas.microsoft.com/office/2019/extlst" xmlns:r="http://schemas.openxmlformats.org/officeDocument/2006/relationships" xmlns:m="http://schemas.openxmlformats.org/officeDocument/2006/math" xmlns:v="urn:schemas-microsoft-com:vml" xmlns:wp14="http://schemas.microsoft.com/office/word/2010/wordprocessingDrawing" xmlns:wp="http://schemas.openxmlformats.org/drawingml/2006/wordprocessingDrawing" xmlns:w10="urn:schemas-microsoft-com:office:word" xmlns:w="http://schemas.openxmlformats.org/wordprocessingml/2006/main" xmlns:w14="http://schemas.microsoft.com/office/word/2010/wordml" xmlns:w15="http://schemas.microsoft.com/office/word/2012/wordml" xmlns:w16cei="http://schemas.microsoft.com/office/word/2026/wordml/cei" xmlns:w16cex="http://schemas.microsoft.com/office/word/2018/wordml/cex" xmlns:w16cid="http://schemas.microsoft.com/office/word/2016/wordml/cid" xmlns:w16="http://schemas.microsoft.com/office/word/2018/wordml" xmlns:w16du="http://schemas.microsoft.com/office/word/2023/wordml/word16du" xmlns:w16sdtdh="http://schemas.microsoft.com/office/word/2020/wordml/sdtdatahash" xmlns:w16sdtfl="http://schemas.microsoft.com/office/word/2024/wordml/sdtformatlock" xmlns:w16se="http://schemas.microsoft.com/office/word/2015/wordml/symex" xmlns:wpg="http://schemas.microsoft.com/office/word/2010/wordprocessingGroup" xmlns:wpi="http://schemas.microsoft.com/office/word/2010/wordprocessingInk" xmlns:wne="http://schemas.microsoft.com/office/word/2006/wordml" xmlns:wps="http://schemas.microsoft.com/office/word/2010/wordprocessingShape" mc:Ignorable="w14 w15 w16se w16cid w16 w16cex w16sdtdh w16sdtfl w16du wp14">
   <w:body>
     <w:p>
       <w:pPr>
@@ -58,284 +58,6 @@
           </wp:anchor>
         </w:drawing>
       </w:r>
-      <w:r>
-        <w:rPr>
-          <w:noProof/>
-          <w:sz w:val="20"/>
-        </w:rPr>
-        <mc:AlternateContent>
-          <mc:Choice Requires="wps">
-            <w:drawing>
-              <wp:anchor distT="0" distB="0" distL="0" distR="0" simplePos="0" relativeHeight="251657216" behindDoc="0" locked="0" layoutInCell="1" allowOverlap="1" wp14:anchorId="258CCBA7" wp14:editId="256D9D09">
-                <wp:simplePos x="0" y="0"/>
-                <wp:positionH relativeFrom="page">
-                  <wp:posOffset>519937</wp:posOffset>
-                </wp:positionH>
-                <wp:positionV relativeFrom="page">
-                  <wp:posOffset>8920254</wp:posOffset>
-                </wp:positionV>
-                <wp:extent cx="1293495" cy="290830"/>
-                <wp:effectExtent l="0" t="0" r="0" b="0"/>
-                <wp:wrapNone/>
-                <wp:docPr id="3" name="Textbox 3"/>
-                <wp:cNvGraphicFramePr>
-                  <a:graphicFrameLocks xmlns:a="http://schemas.openxmlformats.org/drawingml/2006/main"/>
-                </wp:cNvGraphicFramePr>
-                <a:graphic xmlns:a="http://schemas.openxmlformats.org/drawingml/2006/main">
-                  <a:graphicData uri="http://schemas.microsoft.com/office/word/2010/wordprocessingShape">
-                    <wps:wsp>
-                      <wps:cNvSpPr txBox="1">
-                        <a:spLocks/>
-                      </wps:cNvSpPr>
-                      <wps:spPr>
-                        <a:xfrm>
-                          <a:off x="0" y="0"/>
-                          <a:ext cx="1293495" cy="290830"/>
-                        </a:xfrm>
-                        <a:prstGeom prst="rect">
-                          <a:avLst/>
-                        </a:prstGeom>
-                      </wps:spPr>
-                      <wps:txbx>
-                        <w:txbxContent>
-                          <w:tbl>
-                            <w:tblPr>
-                              <w:tblW w:w="0" w:type="auto"/>
-                              <w:tblInd w:w="67" w:type="dxa"/>
-                              <w:tblLayout w:type="fixed"/>
-                              <w:tblCellMar>
-                                <w:left w:w="0" w:type="dxa"/>
-                                <w:right w:w="0" w:type="dxa"/>
-                              </w:tblCellMar>
-                              <w:tblLook w:val="01E0" w:firstRow="1" w:lastRow="1" w:firstColumn="1" w:lastColumn="1" w:noHBand="0" w:noVBand="0"/>
-                            </w:tblPr>
-                            <w:tblGrid>
-                              <w:gridCol w:w="1916"/>
-                            </w:tblGrid>
-                            <w:tr>
-                              <w:trPr>
-                                <w:trHeight w:val="229"/>
-                              </w:trPr>
-                              <w:tc>
-                                <w:tcPr>
-                                  <w:tcW w:w="1916" w:type="dxa"/>
-                                </w:tcPr>
-                                <w:p>
-                                  <w:pPr>
-                                    <w:pStyle w:val="TableParagraph"/>
-                                    <w:spacing w:before="0" w:line="210" w:lineRule="exact"/>
-                                    <w:rPr>
-                                      <w:b/>
-                                      <w:sz w:val="19"/>
-                                    </w:rPr>
-                                  </w:pPr>
-                                  <w:r>
-                                    <w:rPr>
-                                      <w:b/>
-                                      <w:sz w:val="19"/>
-                                    </w:rPr>
-                                    <w:t>Habsi</w:t>
-                                  </w:r>
-                                  <w:r>
-                                    <w:rPr>
-                                      <w:b/>
-                                      <w:spacing w:val="-7"/>
-                                      <w:sz w:val="19"/>
-                                    </w:rPr>
-                                    <w:t xml:space="preserve"> </w:t>
-                                  </w:r>
-                                  <w:r>
-                                    <w:rPr>
-                                      <w:b/>
-                                      <w:sz w:val="19"/>
-                                    </w:rPr>
-                                    <w:t>Gufira</w:t>
-                                  </w:r>
-                                  <w:r>
-                                    <w:rPr>
-                                      <w:b/>
-                                      <w:spacing w:val="-6"/>
-                                      <w:sz w:val="19"/>
-                                    </w:rPr>
-                                    <w:t xml:space="preserve"> </w:t>
-                                  </w:r>
-                                  <w:r>
-                                    <w:rPr>
-                                      <w:b/>
-                                      <w:spacing w:val="-2"/>
-                                      <w:sz w:val="19"/>
-                                    </w:rPr>
-                                    <w:t>Pradana</w:t>
-                                  </w:r>
-                                </w:p>
-                              </w:tc>
-                            </w:tr>
-                            <w:tr>
-                              <w:trPr>
-                                <w:trHeight w:val="229"/>
-                              </w:trPr>
-                              <w:tc>
-                                <w:tcPr>
-                                  <w:tcW w:w="1916" w:type="dxa"/>
-                                </w:tcPr>
-                                <w:p>
-                                  <w:pPr>
-                                    <w:pStyle w:val="TableParagraph"/>
-                                    <w:spacing w:before="11" w:line="198" w:lineRule="exact"/>
-                                    <w:ind w:left="50"/>
-                                    <w:rPr>
-                                      <w:sz w:val="19"/>
-                                    </w:rPr>
-                                  </w:pPr>
-                                  <w:r>
-                                    <w:rPr>
-                                      <w:spacing w:val="-2"/>
-                                      <w:sz w:val="19"/>
-                                    </w:rPr>
-                                    <w:t>Direktur</w:t>
-                                  </w:r>
-                                </w:p>
-                              </w:tc>
-                            </w:tr>
-                          </w:tbl>
-                          <w:p>
-                            <w:pPr>
-                              <w:pStyle w:val="BodyText"/>
-                            </w:pPr>
-                          </w:p>
-                        </w:txbxContent>
-                      </wps:txbx>
-                      <wps:bodyPr wrap="square" lIns="0" tIns="0" rIns="0" bIns="0" rtlCol="0">
-                        <a:noAutofit/>
-                      </wps:bodyPr>
-                    </wps:wsp>
-                  </a:graphicData>
-                </a:graphic>
-              </wp:anchor>
-            </w:drawing>
-          </mc:Choice>
-          <mc:Fallback>
-            <w:pict>
-              <v:shapetype w14:anchorId="258CCBA7" id="_x0000_t202" coordsize="21600,21600" o:spt="202" path="m,l,21600r21600,l21600,xe">
-                <v:stroke joinstyle="miter"/>
-                <v:path gradientshapeok="t" o:connecttype="rect"/>
-              </v:shapetype>
-              <v:shape id="Textbox 3" o:spid="_x0000_s1026" type="#_x0000_t202" style="position:absolute;margin-left:40.95pt;margin-top:702.4pt;width:101.85pt;height:22.9pt;z-index:251657216;visibility:visible;mso-wrap-style:square;mso-wrap-distance-left:0;mso-wrap-distance-top:0;mso-wrap-distance-right:0;mso-wrap-distance-bottom:0;mso-position-horizontal:absolute;mso-position-horizontal-relative:page;mso-position-vertical:absolute;mso-position-vertical-relative:page;v-text-anchor:top" o:gfxdata="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" filled="f" stroked="f">
-                <v:textbox inset="0,0,0,0">
-                  <w:txbxContent>
-                    <w:tbl>
-                      <w:tblPr>
-                        <w:tblW w:w="0" w:type="auto"/>
-                        <w:tblInd w:w="67" w:type="dxa"/>
-                        <w:tblLayout w:type="fixed"/>
-                        <w:tblCellMar>
-                          <w:left w:w="0" w:type="dxa"/>
-                          <w:right w:w="0" w:type="dxa"/>
-                        </w:tblCellMar>
-                        <w:tblLook w:val="01E0" w:firstRow="1" w:lastRow="1" w:firstColumn="1" w:lastColumn="1" w:noHBand="0" w:noVBand="0"/>
-                      </w:tblPr>
-                      <w:tblGrid>
-                        <w:gridCol w:w="1916"/>
-                      </w:tblGrid>
-                      <w:tr>
-                        <w:trPr>
-                          <w:trHeight w:val="229"/>
-                        </w:trPr>
-                        <w:tc>
-                          <w:tcPr>
-                            <w:tcW w:w="1916" w:type="dxa"/>
-                          </w:tcPr>
-                          <w:p>
-                            <w:pPr>
-                              <w:pStyle w:val="TableParagraph"/>
-                              <w:spacing w:before="0" w:line="210" w:lineRule="exact"/>
-                              <w:rPr>
-                                <w:b/>
-                                <w:sz w:val="19"/>
-                              </w:rPr>
-                            </w:pPr>
-                            <w:r>
-                              <w:rPr>
-                                <w:b/>
-                                <w:sz w:val="19"/>
-                              </w:rPr>
-                              <w:t>Habsi</w:t>
-                            </w:r>
-                            <w:r>
-                              <w:rPr>
-                                <w:b/>
-                                <w:spacing w:val="-7"/>
-                                <w:sz w:val="19"/>
-                              </w:rPr>
-                              <w:t xml:space="preserve"> </w:t>
-                            </w:r>
-                            <w:r>
-                              <w:rPr>
-                                <w:b/>
-                                <w:sz w:val="19"/>
-                              </w:rPr>
-                              <w:t>Gufira</w:t>
-                            </w:r>
-                            <w:r>
-                              <w:rPr>
-                                <w:b/>
-                                <w:spacing w:val="-6"/>
-                                <w:sz w:val="19"/>
-                              </w:rPr>
-                              <w:t xml:space="preserve"> </w:t>
-                            </w:r>
-                            <w:r>
-                              <w:rPr>
-                                <w:b/>
-                                <w:spacing w:val="-2"/>
-                                <w:sz w:val="19"/>
-                              </w:rPr>
-                              <w:t>Pradana</w:t>
-                            </w:r>
-                          </w:p>
-                        </w:tc>
-                      </w:tr>
-                      <w:tr>
-                        <w:trPr>
-                          <w:trHeight w:val="229"/>
-                        </w:trPr>
-                        <w:tc>
-                          <w:tcPr>
-                            <w:tcW w:w="1916" w:type="dxa"/>
-                          </w:tcPr>
-                          <w:p>
-                            <w:pPr>
-                              <w:pStyle w:val="TableParagraph"/>
-                              <w:spacing w:before="11" w:line="198" w:lineRule="exact"/>
-                              <w:ind w:left="50"/>
-                              <w:rPr>
-                                <w:sz w:val="19"/>
-                              </w:rPr>
-                            </w:pPr>
-                            <w:r>
-                              <w:rPr>
-                                <w:spacing w:val="-2"/>
-                                <w:sz w:val="19"/>
-                              </w:rPr>
-                              <w:t>Direktur</w:t>
-                            </w:r>
-                          </w:p>
-                        </w:tc>
-                      </w:tr>
-                    </w:tbl>
-                    <w:p>
-                      <w:pPr>
-                        <w:pStyle w:val="BodyText"/>
-                      </w:pPr>
-                    </w:p>
-                  </w:txbxContent>
-                </v:textbox>
-                <w10:wrap anchorx="page" anchory="page"/>
-              </v:shape>
-            </w:pict>
-          </mc:Fallback>
-        </mc:AlternateContent>
-      </w:r>
     </w:p>
     <w:p>
       <w:pPr>
@@ -484,6 +206,21 @@
                 <w:sz w:val="24"/>
               </w:rPr>
               <w:t>OPERATIONAL</w:t>
+            </w:r>
+            <w:r>
+              <w:rPr>
+                <w:b/>
+                <w:sz w:val="24"/>
+              </w:rPr>
+              <w:t xml:space="preserve"> </w:t>
+            </w:r>
+            <w:r>
+              <w:rPr>
+                <w:b/>
+                <w:sz w:val="24"/>
+                <w:lang w:val="id-ID"/>
+              </w:rPr>
+              <w:t>RIKSA UJI</w:t>
             </w:r>
           </w:p>
         </w:tc>
@@ -2581,7 +2318,7 @@
         <mc:AlternateContent>
           <mc:Choice Requires="wps">
             <w:drawing>
-              <wp:anchor distT="0" distB="0" distL="0" distR="0" simplePos="0" relativeHeight="251658240" behindDoc="1" locked="0" layoutInCell="1" allowOverlap="1" wp14:anchorId="792E342A" wp14:editId="7C941D8D">
+              <wp:anchor distT="0" distB="0" distL="0" distR="0" simplePos="0" relativeHeight="251657216" behindDoc="1" locked="0" layoutInCell="1" allowOverlap="1" wp14:anchorId="792E342A" wp14:editId="7C941D8D">
                 <wp:simplePos x="0" y="0"/>
                 <wp:positionH relativeFrom="page">
                   <wp:posOffset>375158</wp:posOffset>
@@ -2643,6 +2380,7 @@
                                     <w:rPr>
                                       <w:b/>
                                       <w:sz w:val="19"/>
+                                      <w:u w:val="single"/>
                                     </w:rPr>
                                   </w:pPr>
                                   <w:r>
@@ -2650,8 +2388,27 @@
                                       <w:b/>
                                       <w:spacing w:val="-2"/>
                                       <w:sz w:val="19"/>
+                                      <w:u w:val="single"/>
                                     </w:rPr>
-                                    <w:t>${nama_penandatangan}</w:t>
+                                    <w:t>${nama_</w:t>
+                                  </w:r>
+                                  <w:r>
+                                    <w:rPr>
+                                      <w:b/>
+                                      <w:spacing w:val="-2"/>
+                                      <w:sz w:val="19"/>
+                                      <w:u w:val="single"/>
+                                    </w:rPr>
+                                    <w:t>pengajuan</w:t>
+                                  </w:r>
+                                  <w:r>
+                                    <w:rPr>
+                                      <w:b/>
+                                      <w:spacing w:val="-2"/>
+                                      <w:sz w:val="19"/>
+                                      <w:u w:val="single"/>
+                                    </w:rPr>
+                                    <w:t>}</w:t>
                                   </w:r>
                                 </w:p>
                               </w:tc>
@@ -2670,14 +2427,30 @@
                                     <w:spacing w:before="11" w:line="198" w:lineRule="exact"/>
                                     <w:ind w:left="3"/>
                                     <w:rPr>
+                                      <w:b/>
                                       <w:sz w:val="19"/>
                                     </w:rPr>
                                   </w:pPr>
                                   <w:r>
                                     <w:rPr>
+                                      <w:b/>
                                       <w:sz w:val="19"/>
                                     </w:rPr>
-                                    <w:t>${jabatan_penandatangan}</w:t>
+                                    <w:t>${jabatan_</w:t>
+                                  </w:r>
+                                  <w:r>
+                                    <w:rPr>
+                                      <w:b/>
+                                      <w:sz w:val="19"/>
+                                    </w:rPr>
+                                    <w:t>pengajuan</w:t>
+                                  </w:r>
+                                  <w:r>
+                                    <w:rPr>
+                                      <w:b/>
+                                      <w:sz w:val="19"/>
+                                    </w:rPr>
+                                    <w:t>}</w:t>
                                   </w:r>
                                 </w:p>
                               </w:tc>
@@ -2686,6 +2459,9 @@
                           <w:p>
                             <w:pPr>
                               <w:pStyle w:val="BodyText"/>
+                              <w:rPr>
+                                <w:b/>
+                              </w:rPr>
                             </w:pPr>
                           </w:p>
                         </w:txbxContent>
@@ -2701,7 +2477,11 @@
           </mc:Choice>
           <mc:Fallback>
             <w:pict>
-              <v:shape w14:anchorId="792E342A" id="Textbox 4" o:spid="_x0000_s1027" type="#_x0000_t202" style="position:absolute;margin-left:29.55pt;margin-top:18.4pt;width:126.95pt;height:23pt;z-index:-251658240;visibility:visible;mso-wrap-style:square;mso-wrap-distance-left:0;mso-wrap-distance-top:0;mso-wrap-distance-right:0;mso-wrap-distance-bottom:0;mso-position-horizontal:absolute;mso-position-horizontal-relative:page;mso-position-vertical:absolute;mso-position-vertical-relative:text;v-text-anchor:top" o:gfxdata="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" filled="f" stroked="f">
+              <v:shapetype w14:anchorId="792E342A" id="_x0000_t202" coordsize="21600,21600" o:spt="202" path="m,l,21600r21600,l21600,xe">
+                <v:stroke joinstyle="miter"/>
+                <v:path gradientshapeok="t" o:connecttype="rect"/>
+              </v:shapetype>
+              <v:shape id="Textbox 4" o:spid="_x0000_s1026" type="#_x0000_t202" style="position:absolute;margin-left:29.55pt;margin-top:18.4pt;width:126.95pt;height:23pt;z-index:-251659264;visibility:visible;mso-wrap-style:square;mso-wrap-distance-left:0;mso-wrap-distance-top:0;mso-wrap-distance-right:0;mso-wrap-distance-bottom:0;mso-position-horizontal:absolute;mso-position-horizontal-relative:page;mso-position-vertical:absolute;mso-position-vertical-relative:text;v-text-anchor:top" o:gfxdata="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" filled="f" stroked="f">
                 <v:textbox inset="0,0,0,0">
                   <w:txbxContent>
                     <w:tbl>
@@ -2734,6 +2514,7 @@
                               <w:rPr>
                                 <w:b/>
                                 <w:sz w:val="19"/>
+                                <w:u w:val="single"/>
                               </w:rPr>
                             </w:pPr>
                             <w:r>
@@ -2741,8 +2522,27 @@
                                 <w:b/>
                                 <w:spacing w:val="-2"/>
                                 <w:sz w:val="19"/>
+                                <w:u w:val="single"/>
                               </w:rPr>
-                              <w:t>${nama_penandatangan}</w:t>
+                              <w:t>${nama_</w:t>
+                            </w:r>
+                            <w:r>
+                              <w:rPr>
+                                <w:b/>
+                                <w:spacing w:val="-2"/>
+                                <w:sz w:val="19"/>
+                                <w:u w:val="single"/>
+                              </w:rPr>
+                              <w:t>pengajuan</w:t>
+                            </w:r>
+                            <w:r>
+                              <w:rPr>
+                                <w:b/>
+                                <w:spacing w:val="-2"/>
+                                <w:sz w:val="19"/>
+                                <w:u w:val="single"/>
+                              </w:rPr>
+                              <w:t>}</w:t>
                             </w:r>
                           </w:p>
                         </w:tc>
@@ -2761,14 +2561,30 @@
                               <w:spacing w:before="11" w:line="198" w:lineRule="exact"/>
                               <w:ind w:left="3"/>
                               <w:rPr>
+                                <w:b/>
                                 <w:sz w:val="19"/>
                               </w:rPr>
                             </w:pPr>
                             <w:r>
                               <w:rPr>
+                                <w:b/>
                                 <w:sz w:val="19"/>
                               </w:rPr>
-                              <w:t>${jabatan_penandatangan}</w:t>
+                              <w:t>${jabatan_</w:t>
+                            </w:r>
+                            <w:r>
+                              <w:rPr>
+                                <w:b/>
+                                <w:sz w:val="19"/>
+                              </w:rPr>
+                              <w:t>pengajuan</w:t>
+                            </w:r>
+                            <w:r>
+                              <w:rPr>
+                                <w:b/>
+                                <w:sz w:val="19"/>
+                              </w:rPr>
+                              <w:t>}</w:t>
                             </w:r>
                           </w:p>
                         </w:tc>
@@ -2777,6 +2593,9 @@
                     <w:p>
                       <w:pPr>
                         <w:pStyle w:val="BodyText"/>
+                        <w:rPr>
+                          <w:b/>
+                        </w:rPr>
                       </w:pPr>
                     </w:p>
                   </w:txbxContent>
@@ -2795,7 +2614,7 @@
         <mc:AlternateContent>
           <mc:Choice Requires="wps">
             <w:drawing>
-              <wp:anchor distT="0" distB="0" distL="0" distR="0" simplePos="0" relativeHeight="251659264" behindDoc="1" locked="0" layoutInCell="1" allowOverlap="1" wp14:anchorId="593E9272" wp14:editId="508512BA">
+              <wp:anchor distT="0" distB="0" distL="0" distR="0" simplePos="0" relativeHeight="251660288" behindDoc="1" locked="0" layoutInCell="1" allowOverlap="1" wp14:anchorId="593E9272" wp14:editId="508512BA">
                 <wp:simplePos x="0" y="0"/>
                 <wp:positionH relativeFrom="page">
                   <wp:posOffset>5597271</wp:posOffset>
@@ -2852,6 +2671,48 @@
                                 <w:p>
                                   <w:pPr>
                                     <w:pStyle w:val="TableParagraph"/>
+                                    <w:spacing w:line="210" w:lineRule="exact"/>
+                                    <w:ind w:left="4" w:right="4"/>
+                                    <w:rPr>
+                                      <w:b/>
+                                      <w:sz w:val="19"/>
+                                      <w:u w:val="single"/>
+                                      <w:lang w:val="id-ID"/>
+                                    </w:rPr>
+                                  </w:pPr>
+                                  <w:r>
+                                    <w:rPr>
+                                      <w:b/>
+                                      <w:sz w:val="19"/>
+                                      <w:u w:val="single"/>
+                                      <w:lang w:val="id-ID"/>
+                                    </w:rPr>
+                                    <w:t>Zulfan Rafly Baihaqi</w:t>
+                                  </w:r>
+                                </w:p>
+                                <w:p>
+                                  <w:pPr>
+                                    <w:pStyle w:val="TableParagraph"/>
+                                    <w:spacing w:before="0" w:line="210" w:lineRule="exact"/>
+                                    <w:ind w:left="4" w:right="4"/>
+                                    <w:rPr>
+                                      <w:b/>
+                                      <w:sz w:val="19"/>
+                                      <w:lang w:val="id-ID"/>
+                                    </w:rPr>
+                                  </w:pPr>
+                                  <w:r>
+                                    <w:rPr>
+                                      <w:b/>
+                                      <w:sz w:val="19"/>
+                                      <w:lang w:val="id-ID"/>
+                                    </w:rPr>
+                                    <w:t>Finance</w:t>
+                                  </w:r>
+                                </w:p>
+                                <w:p>
+                                  <w:pPr>
+                                    <w:pStyle w:val="TableParagraph"/>
                                     <w:spacing w:before="0" w:line="210" w:lineRule="exact"/>
                                     <w:ind w:left="4" w:right="4"/>
                                     <w:rPr>
@@ -2859,58 +2720,6 @@
                                       <w:sz w:val="19"/>
                                     </w:rPr>
                                   </w:pPr>
-                                  <w:r>
-                                    <w:rPr>
-                                      <w:b/>
-                                      <w:sz w:val="19"/>
-                                    </w:rPr>
-                                    <w:t>Muhammad</w:t>
-                                  </w:r>
-                                  <w:r>
-                                    <w:rPr>
-                                      <w:b/>
-                                      <w:spacing w:val="-10"/>
-                                      <w:sz w:val="19"/>
-                                    </w:rPr>
-                                    <w:t xml:space="preserve"> </w:t>
-                                  </w:r>
-                                  <w:r>
-                                    <w:rPr>
-                                      <w:b/>
-                                      <w:sz w:val="19"/>
-                                    </w:rPr>
-                                    <w:t>Fa</w:t>
-                                  </w:r>
-                                  <w:r>
-                                    <w:rPr>
-                                      <w:b/>
-                                      <w:sz w:val="19"/>
-                                    </w:rPr>
-                                    <w:t>z</w:t>
-                                  </w:r>
-                                  <w:r>
-                                    <w:rPr>
-                                      <w:b/>
-                                      <w:sz w:val="19"/>
-                                    </w:rPr>
-                                    <w:t>ar</w:t>
-                                  </w:r>
-                                  <w:r>
-                                    <w:rPr>
-                                      <w:b/>
-                                      <w:spacing w:val="-11"/>
-                                      <w:sz w:val="19"/>
-                                    </w:rPr>
-                                    <w:t xml:space="preserve"> </w:t>
-                                  </w:r>
-                                  <w:r>
-                                    <w:rPr>
-                                      <w:b/>
-                                      <w:spacing w:val="-2"/>
-                                      <w:sz w:val="19"/>
-                                    </w:rPr>
-                                    <w:t>Maulana</w:t>
-                                  </w:r>
                                 </w:p>
                               </w:tc>
                             </w:tr>
@@ -2928,17 +2737,20 @@
                                     <w:spacing w:before="11" w:line="198" w:lineRule="exact"/>
                                     <w:ind w:left="4"/>
                                     <w:rPr>
+                                      <w:b/>
                                       <w:sz w:val="19"/>
                                     </w:rPr>
                                   </w:pPr>
                                   <w:r>
                                     <w:rPr>
+                                      <w:b/>
                                       <w:sz w:val="19"/>
                                     </w:rPr>
                                     <w:t>Leader</w:t>
                                   </w:r>
                                   <w:r>
                                     <w:rPr>
+                                      <w:b/>
                                       <w:spacing w:val="-11"/>
                                       <w:sz w:val="19"/>
                                     </w:rPr>
@@ -2946,6 +2758,7 @@
                                   </w:r>
                                   <w:r>
                                     <w:rPr>
+                                      <w:b/>
                                       <w:spacing w:val="-2"/>
                                       <w:sz w:val="19"/>
                                     </w:rPr>
@@ -2958,6 +2771,9 @@
                           <w:p>
                             <w:pPr>
                               <w:pStyle w:val="BodyText"/>
+                              <w:rPr>
+                                <w:b/>
+                              </w:rPr>
                             </w:pPr>
                           </w:p>
                         </w:txbxContent>
@@ -2973,7 +2789,7 @@
           </mc:Choice>
           <mc:Fallback>
             <w:pict>
-              <v:shape w14:anchorId="593E9272" id="Textbox 5" o:spid="_x0000_s1028" type="#_x0000_t202" style="position:absolute;margin-left:440.75pt;margin-top:18.4pt;width:119pt;height:23pt;z-index:-251657216;visibility:visible;mso-wrap-style:square;mso-wrap-distance-left:0;mso-wrap-distance-top:0;mso-wrap-distance-right:0;mso-wrap-distance-bottom:0;mso-position-horizontal:absolute;mso-position-horizontal-relative:page;mso-position-vertical:absolute;mso-position-vertical-relative:text;v-text-anchor:top" o:gfxdata="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" filled="f" stroked="f">
+              <v:shape w14:anchorId="593E9272" id="Textbox 5" o:spid="_x0000_s1027" type="#_x0000_t202" style="position:absolute;margin-left:440.75pt;margin-top:18.4pt;width:119pt;height:23pt;z-index:-251656192;visibility:visible;mso-wrap-style:square;mso-wrap-distance-left:0;mso-wrap-distance-top:0;mso-wrap-distance-right:0;mso-wrap-distance-bottom:0;mso-position-horizontal:absolute;mso-position-horizontal-relative:page;mso-position-vertical:absolute;mso-position-vertical-relative:text;v-text-anchor:top" o:gfxdata="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" filled="f" stroked="f">
                 <v:textbox inset="0,0,0,0">
                   <w:txbxContent>
                     <w:tbl>
@@ -3001,6 +2817,48 @@
                           <w:p>
                             <w:pPr>
                               <w:pStyle w:val="TableParagraph"/>
+                              <w:spacing w:line="210" w:lineRule="exact"/>
+                              <w:ind w:left="4" w:right="4"/>
+                              <w:rPr>
+                                <w:b/>
+                                <w:sz w:val="19"/>
+                                <w:u w:val="single"/>
+                                <w:lang w:val="id-ID"/>
+                              </w:rPr>
+                            </w:pPr>
+                            <w:r>
+                              <w:rPr>
+                                <w:b/>
+                                <w:sz w:val="19"/>
+                                <w:u w:val="single"/>
+                                <w:lang w:val="id-ID"/>
+                              </w:rPr>
+                              <w:t>Zulfan Rafly Baihaqi</w:t>
+                            </w:r>
+                          </w:p>
+                          <w:p>
+                            <w:pPr>
+                              <w:pStyle w:val="TableParagraph"/>
+                              <w:spacing w:before="0" w:line="210" w:lineRule="exact"/>
+                              <w:ind w:left="4" w:right="4"/>
+                              <w:rPr>
+                                <w:b/>
+                                <w:sz w:val="19"/>
+                                <w:lang w:val="id-ID"/>
+                              </w:rPr>
+                            </w:pPr>
+                            <w:r>
+                              <w:rPr>
+                                <w:b/>
+                                <w:sz w:val="19"/>
+                                <w:lang w:val="id-ID"/>
+                              </w:rPr>
+                              <w:t>Finance</w:t>
+                            </w:r>
+                          </w:p>
+                          <w:p>
+                            <w:pPr>
+                              <w:pStyle w:val="TableParagraph"/>
                               <w:spacing w:before="0" w:line="210" w:lineRule="exact"/>
                               <w:ind w:left="4" w:right="4"/>
                               <w:rPr>
@@ -3008,58 +2866,6 @@
                                 <w:sz w:val="19"/>
                               </w:rPr>
                             </w:pPr>
-                            <w:r>
-                              <w:rPr>
-                                <w:b/>
-                                <w:sz w:val="19"/>
-                              </w:rPr>
-                              <w:t>Muhammad</w:t>
-                            </w:r>
-                            <w:r>
-                              <w:rPr>
-                                <w:b/>
-                                <w:spacing w:val="-10"/>
-                                <w:sz w:val="19"/>
-                              </w:rPr>
-                              <w:t xml:space="preserve"> </w:t>
-                            </w:r>
-                            <w:r>
-                              <w:rPr>
-                                <w:b/>
-                                <w:sz w:val="19"/>
-                              </w:rPr>
-                              <w:t>Fa</w:t>
-                            </w:r>
-                            <w:r>
-                              <w:rPr>
-                                <w:b/>
-                                <w:sz w:val="19"/>
-                              </w:rPr>
-                              <w:t>z</w:t>
-                            </w:r>
-                            <w:r>
-                              <w:rPr>
-                                <w:b/>
-                                <w:sz w:val="19"/>
-                              </w:rPr>
-                              <w:t>ar</w:t>
-                            </w:r>
-                            <w:r>
-                              <w:rPr>
-                                <w:b/>
-                                <w:spacing w:val="-11"/>
-                                <w:sz w:val="19"/>
-                              </w:rPr>
-                              <w:t xml:space="preserve"> </w:t>
-                            </w:r>
-                            <w:r>
-                              <w:rPr>
-                                <w:b/>
-                                <w:spacing w:val="-2"/>
-                                <w:sz w:val="19"/>
-                              </w:rPr>
-                              <w:t>Maulana</w:t>
-                            </w:r>
                           </w:p>
                         </w:tc>
                       </w:tr>
@@ -3077,17 +2883,20 @@
                               <w:spacing w:before="11" w:line="198" w:lineRule="exact"/>
                               <w:ind w:left="4"/>
                               <w:rPr>
+                                <w:b/>
                                 <w:sz w:val="19"/>
                               </w:rPr>
                             </w:pPr>
                             <w:r>
                               <w:rPr>
+                                <w:b/>
                                 <w:sz w:val="19"/>
                               </w:rPr>
                               <w:t>Leader</w:t>
                             </w:r>
                             <w:r>
                               <w:rPr>
+                                <w:b/>
                                 <w:spacing w:val="-11"/>
                                 <w:sz w:val="19"/>
                               </w:rPr>
@@ -3095,6 +2904,7 @@
                             </w:r>
                             <w:r>
                               <w:rPr>
+                                <w:b/>
                                 <w:spacing w:val="-2"/>
                                 <w:sz w:val="19"/>
                               </w:rPr>
@@ -3107,6 +2917,9 @@
                     <w:p>
                       <w:pPr>
                         <w:pStyle w:val="BodyText"/>
+                        <w:rPr>
+                          <w:b/>
+                        </w:rPr>
                       </w:pPr>
                     </w:p>
                   </w:txbxContent>
@@ -3129,12 +2942,635 @@
         <w:pStyle w:val="BodyText"/>
         <w:ind w:left="5"/>
         <w:jc w:val="center"/>
+        <w:rPr>
+          <w:spacing w:val="-2"/>
+        </w:rPr>
       </w:pPr>
       <w:r>
         <w:rPr>
           <w:spacing w:val="-2"/>
         </w:rPr>
         <w:t>Mengetahui,</w:t>
+      </w:r>
+    </w:p>
+    <w:p>
+      <w:pPr>
+        <w:pStyle w:val="BodyText"/>
+        <w:ind w:left="5"/>
+        <w:jc w:val="center"/>
+      </w:pPr>
+      <w:r>
+        <w:rPr>
+          <w:noProof/>
+          <w:sz w:val="20"/>
+        </w:rPr>
+        <mc:AlternateContent>
+          <mc:Choice Requires="wps">
+            <w:drawing>
+              <wp:anchor distT="0" distB="0" distL="0" distR="0" simplePos="0" relativeHeight="251656192" behindDoc="0" locked="0" layoutInCell="1" allowOverlap="1" wp14:anchorId="258CCBA7" wp14:editId="0B65FFCC">
+                <wp:simplePos x="0" y="0"/>
+                <wp:positionH relativeFrom="page">
+                  <wp:posOffset>551180</wp:posOffset>
+                </wp:positionH>
+                <wp:positionV relativeFrom="page">
+                  <wp:posOffset>8919845</wp:posOffset>
+                </wp:positionV>
+                <wp:extent cx="1293495" cy="290830"/>
+                <wp:effectExtent l="0" t="0" r="0" b="0"/>
+                <wp:wrapNone/>
+                <wp:docPr id="3" name="Textbox 3"/>
+                <wp:cNvGraphicFramePr>
+                  <a:graphicFrameLocks xmlns:a="http://schemas.openxmlformats.org/drawingml/2006/main"/>
+                </wp:cNvGraphicFramePr>
+                <a:graphic xmlns:a="http://schemas.openxmlformats.org/drawingml/2006/main">
+                  <a:graphicData uri="http://schemas.microsoft.com/office/word/2010/wordprocessingShape">
+                    <wps:wsp>
+                      <wps:cNvSpPr txBox="1">
+                        <a:spLocks/>
+                      </wps:cNvSpPr>
+                      <wps:spPr>
+                        <a:xfrm>
+                          <a:off x="0" y="0"/>
+                          <a:ext cx="1293495" cy="290830"/>
+                        </a:xfrm>
+                        <a:prstGeom prst="rect">
+                          <a:avLst/>
+                        </a:prstGeom>
+                      </wps:spPr>
+                      <wps:txbx>
+                        <w:txbxContent>
+                          <w:tbl>
+                            <w:tblPr>
+                              <w:tblW w:w="0" w:type="auto"/>
+                              <w:tblInd w:w="67" w:type="dxa"/>
+                              <w:tblLayout w:type="fixed"/>
+                              <w:tblCellMar>
+                                <w:left w:w="0" w:type="dxa"/>
+                                <w:right w:w="0" w:type="dxa"/>
+                              </w:tblCellMar>
+                              <w:tblLook w:val="01E0" w:firstRow="1" w:lastRow="1" w:firstColumn="1" w:lastColumn="1" w:noHBand="0" w:noVBand="0"/>
+                            </w:tblPr>
+                            <w:tblGrid>
+                              <w:gridCol w:w="1916"/>
+                            </w:tblGrid>
+                            <w:tr>
+                              <w:trPr>
+                                <w:trHeight w:val="229"/>
+                              </w:trPr>
+                              <w:tc>
+                                <w:tcPr>
+                                  <w:tcW w:w="1916" w:type="dxa"/>
+                                </w:tcPr>
+                                <w:p>
+                                  <w:pPr>
+                                    <w:pStyle w:val="TableParagraph"/>
+                                    <w:spacing w:before="0" w:line="210" w:lineRule="exact"/>
+                                    <w:rPr>
+                                      <w:b/>
+                                      <w:sz w:val="19"/>
+                                      <w:u w:val="single"/>
+                                    </w:rPr>
+                                  </w:pPr>
+                                  <w:r>
+                                    <w:rPr>
+                                      <w:b/>
+                                      <w:sz w:val="19"/>
+                                      <w:u w:val="single"/>
+                                    </w:rPr>
+                                    <w:t>Habsi</w:t>
+                                  </w:r>
+                                  <w:r>
+                                    <w:rPr>
+                                      <w:b/>
+                                      <w:spacing w:val="-7"/>
+                                      <w:sz w:val="19"/>
+                                      <w:u w:val="single"/>
+                                    </w:rPr>
+                                    <w:t xml:space="preserve"> </w:t>
+                                  </w:r>
+                                  <w:r>
+                                    <w:rPr>
+                                      <w:b/>
+                                      <w:sz w:val="19"/>
+                                      <w:u w:val="single"/>
+                                    </w:rPr>
+                                    <w:t>Gufira</w:t>
+                                  </w:r>
+                                  <w:r>
+                                    <w:rPr>
+                                      <w:b/>
+                                      <w:spacing w:val="-6"/>
+                                      <w:sz w:val="19"/>
+                                      <w:u w:val="single"/>
+                                    </w:rPr>
+                                    <w:t xml:space="preserve"> </w:t>
+                                  </w:r>
+                                  <w:r>
+                                    <w:rPr>
+                                      <w:b/>
+                                      <w:spacing w:val="-2"/>
+                                      <w:sz w:val="19"/>
+                                      <w:u w:val="single"/>
+                                    </w:rPr>
+                                    <w:t>Pradana</w:t>
+                                  </w:r>
+                                </w:p>
+                              </w:tc>
+                            </w:tr>
+                            <w:tr>
+                              <w:trPr>
+                                <w:trHeight w:val="229"/>
+                              </w:trPr>
+                              <w:tc>
+                                <w:tcPr>
+                                  <w:tcW w:w="1916" w:type="dxa"/>
+                                </w:tcPr>
+                                <w:p>
+                                  <w:pPr>
+                                    <w:pStyle w:val="TableParagraph"/>
+                                    <w:spacing w:before="11" w:line="198" w:lineRule="exact"/>
+                                    <w:ind w:left="50"/>
+                                    <w:rPr>
+                                      <w:b/>
+                                      <w:sz w:val="19"/>
+                                    </w:rPr>
+                                  </w:pPr>
+                                  <w:r>
+                                    <w:rPr>
+                                      <w:b/>
+                                      <w:spacing w:val="-2"/>
+                                      <w:sz w:val="19"/>
+                                    </w:rPr>
+                                    <w:t>Direktur</w:t>
+                                  </w:r>
+                                </w:p>
+                              </w:tc>
+                            </w:tr>
+                          </w:tbl>
+                          <w:p>
+                            <w:pPr>
+                              <w:pStyle w:val="BodyText"/>
+                            </w:pPr>
+                          </w:p>
+                        </w:txbxContent>
+                      </wps:txbx>
+                      <wps:bodyPr wrap="square" lIns="0" tIns="0" rIns="0" bIns="0" rtlCol="0">
+                        <a:noAutofit/>
+                      </wps:bodyPr>
+                    </wps:wsp>
+                  </a:graphicData>
+                </a:graphic>
+              </wp:anchor>
+            </w:drawing>
+          </mc:Choice>
+          <mc:Fallback>
+            <w:pict>
+              <v:shape w14:anchorId="258CCBA7" id="Textbox 3" o:spid="_x0000_s1028" type="#_x0000_t202" style="position:absolute;left:0;text-align:left;margin-left:43.4pt;margin-top:702.35pt;width:101.85pt;height:22.9pt;z-index:251656192;visibility:visible;mso-wrap-style:square;mso-wrap-distance-left:0;mso-wrap-distance-top:0;mso-wrap-distance-right:0;mso-wrap-distance-bottom:0;mso-position-horizontal:absolute;mso-position-horizontal-relative:page;mso-position-vertical:absolute;mso-position-vertical-relative:page;v-text-anchor:top" o:gfxdata="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" filled="f" stroked="f">
+                <v:textbox inset="0,0,0,0">
+                  <w:txbxContent>
+                    <w:tbl>
+                      <w:tblPr>
+                        <w:tblW w:w="0" w:type="auto"/>
+                        <w:tblInd w:w="67" w:type="dxa"/>
+                        <w:tblLayout w:type="fixed"/>
+                        <w:tblCellMar>
+                          <w:left w:w="0" w:type="dxa"/>
+                          <w:right w:w="0" w:type="dxa"/>
+                        </w:tblCellMar>
+                        <w:tblLook w:val="01E0" w:firstRow="1" w:lastRow="1" w:firstColumn="1" w:lastColumn="1" w:noHBand="0" w:noVBand="0"/>
+                      </w:tblPr>
+                      <w:tblGrid>
+                        <w:gridCol w:w="1916"/>
+                      </w:tblGrid>
+                      <w:tr>
+                        <w:trPr>
+                          <w:trHeight w:val="229"/>
+                        </w:trPr>
+                        <w:tc>
+                          <w:tcPr>
+                            <w:tcW w:w="1916" w:type="dxa"/>
+                          </w:tcPr>
+                          <w:p>
+                            <w:pPr>
+                              <w:pStyle w:val="TableParagraph"/>
+                              <w:spacing w:before="0" w:line="210" w:lineRule="exact"/>
+                              <w:rPr>
+                                <w:b/>
+                                <w:sz w:val="19"/>
+                                <w:u w:val="single"/>
+                              </w:rPr>
+                            </w:pPr>
+                            <w:r>
+                              <w:rPr>
+                                <w:b/>
+                                <w:sz w:val="19"/>
+                                <w:u w:val="single"/>
+                              </w:rPr>
+                              <w:t>Habsi</w:t>
+                            </w:r>
+                            <w:r>
+                              <w:rPr>
+                                <w:b/>
+                                <w:spacing w:val="-7"/>
+                                <w:sz w:val="19"/>
+                                <w:u w:val="single"/>
+                              </w:rPr>
+                              <w:t xml:space="preserve"> </w:t>
+                            </w:r>
+                            <w:r>
+                              <w:rPr>
+                                <w:b/>
+                                <w:sz w:val="19"/>
+                                <w:u w:val="single"/>
+                              </w:rPr>
+                              <w:t>Gufira</w:t>
+                            </w:r>
+                            <w:r>
+                              <w:rPr>
+                                <w:b/>
+                                <w:spacing w:val="-6"/>
+                                <w:sz w:val="19"/>
+                                <w:u w:val="single"/>
+                              </w:rPr>
+                              <w:t xml:space="preserve"> </w:t>
+                            </w:r>
+                            <w:r>
+                              <w:rPr>
+                                <w:b/>
+                                <w:spacing w:val="-2"/>
+                                <w:sz w:val="19"/>
+                                <w:u w:val="single"/>
+                              </w:rPr>
+                              <w:t>Pradana</w:t>
+                            </w:r>
+                          </w:p>
+                        </w:tc>
+                      </w:tr>
+                      <w:tr>
+                        <w:trPr>
+                          <w:trHeight w:val="229"/>
+                        </w:trPr>
+                        <w:tc>
+                          <w:tcPr>
+                            <w:tcW w:w="1916" w:type="dxa"/>
+                          </w:tcPr>
+                          <w:p>
+                            <w:pPr>
+                              <w:pStyle w:val="TableParagraph"/>
+                              <w:spacing w:before="11" w:line="198" w:lineRule="exact"/>
+                              <w:ind w:left="50"/>
+                              <w:rPr>
+                                <w:b/>
+                                <w:sz w:val="19"/>
+                              </w:rPr>
+                            </w:pPr>
+                            <w:r>
+                              <w:rPr>
+                                <w:b/>
+                                <w:spacing w:val="-2"/>
+                                <w:sz w:val="19"/>
+                              </w:rPr>
+                              <w:t>Direktur</w:t>
+                            </w:r>
+                          </w:p>
+                        </w:tc>
+                      </w:tr>
+                    </w:tbl>
+                    <w:p>
+                      <w:pPr>
+                        <w:pStyle w:val="BodyText"/>
+                      </w:pPr>
+                    </w:p>
+                  </w:txbxContent>
+                </v:textbox>
+                <w10:wrap anchorx="page" anchory="page"/>
+              </v:shape>
+            </w:pict>
+          </mc:Fallback>
+        </mc:AlternateContent>
+      </w:r>
+      <w:r>
+        <w:rPr>
+          <w:noProof/>
+          <w:sz w:val="20"/>
+        </w:rPr>
+        <mc:AlternateContent>
+          <mc:Choice Requires="wps">
+            <w:drawing>
+              <wp:anchor distT="0" distB="0" distL="0" distR="0" simplePos="0" relativeHeight="251661312" behindDoc="1" locked="0" layoutInCell="1" allowOverlap="1" wp14:anchorId="75020C2C" wp14:editId="6C0CA55C">
+                <wp:simplePos x="0" y="0"/>
+                <wp:positionH relativeFrom="page">
+                  <wp:posOffset>5796280</wp:posOffset>
+                </wp:positionH>
+                <wp:positionV relativeFrom="page">
+                  <wp:posOffset>8923020</wp:posOffset>
+                </wp:positionV>
+                <wp:extent cx="1390650" cy="290830"/>
+                <wp:effectExtent l="0" t="0" r="0" b="0"/>
+                <wp:wrapThrough wrapText="bothSides">
+                  <wp:wrapPolygon edited="0">
+                    <wp:start x="0" y="0"/>
+                    <wp:lineTo x="0" y="21600"/>
+                    <wp:lineTo x="21600" y="21600"/>
+                    <wp:lineTo x="21600" y="0"/>
+                  </wp:wrapPolygon>
+                </wp:wrapThrough>
+                <wp:docPr id="1" name="Textbox 1"/>
+                <wp:cNvGraphicFramePr>
+                  <a:graphicFrameLocks xmlns:a="http://schemas.openxmlformats.org/drawingml/2006/main"/>
+                </wp:cNvGraphicFramePr>
+                <a:graphic xmlns:a="http://schemas.openxmlformats.org/drawingml/2006/main">
+                  <a:graphicData uri="http://schemas.microsoft.com/office/word/2010/wordprocessingShape">
+                    <wps:wsp>
+                      <wps:cNvSpPr txBox="1">
+                        <a:spLocks/>
+                      </wps:cNvSpPr>
+                      <wps:spPr>
+                        <a:xfrm>
+                          <a:off x="0" y="0"/>
+                          <a:ext cx="1390650" cy="290830"/>
+                        </a:xfrm>
+                        <a:prstGeom prst="rect">
+                          <a:avLst/>
+                        </a:prstGeom>
+                      </wps:spPr>
+                      <wps:txbx>
+                        <w:txbxContent>
+                          <w:tbl>
+                            <w:tblPr>
+                              <w:tblW w:w="0" w:type="auto"/>
+                              <w:tblInd w:w="67" w:type="dxa"/>
+                              <w:tblLayout w:type="fixed"/>
+                              <w:tblCellMar>
+                                <w:left w:w="0" w:type="dxa"/>
+                                <w:right w:w="0" w:type="dxa"/>
+                              </w:tblCellMar>
+                              <w:tblLook w:val="01E0" w:firstRow="1" w:lastRow="1" w:firstColumn="1" w:lastColumn="1" w:noHBand="0" w:noVBand="0"/>
+                            </w:tblPr>
+                            <w:tblGrid>
+                              <w:gridCol w:w="2069"/>
+                            </w:tblGrid>
+                            <w:tr>
+                              <w:trPr>
+                                <w:trHeight w:val="229"/>
+                              </w:trPr>
+                              <w:tc>
+                                <w:tcPr>
+                                  <w:tcW w:w="2069" w:type="dxa"/>
+                                </w:tcPr>
+                                <w:p>
+                                  <w:pPr>
+                                    <w:pStyle w:val="TableParagraph"/>
+                                    <w:spacing w:before="0" w:line="210" w:lineRule="exact"/>
+                                    <w:ind w:left="2" w:right="2"/>
+                                    <w:jc w:val="left"/>
+                                    <w:rPr>
+                                      <w:b/>
+                                      <w:sz w:val="19"/>
+                                      <w:u w:val="single"/>
+                                    </w:rPr>
+                                  </w:pPr>
+                                  <w:r>
+                                    <w:rPr>
+                                      <w:b/>
+                                      <w:sz w:val="19"/>
+                                      <w:u w:val="single"/>
+                                    </w:rPr>
+                                    <w:t>Nur</w:t>
+                                  </w:r>
+                                  <w:r>
+                                    <w:rPr>
+                                      <w:b/>
+                                      <w:spacing w:val="-7"/>
+                                      <w:sz w:val="19"/>
+                                      <w:u w:val="single"/>
+                                    </w:rPr>
+                                    <w:t xml:space="preserve"> </w:t>
+                                  </w:r>
+                                  <w:r>
+                                    <w:rPr>
+                                      <w:b/>
+                                      <w:sz w:val="19"/>
+                                      <w:u w:val="single"/>
+                                    </w:rPr>
+                                    <w:t>Annisa</w:t>
+                                  </w:r>
+                                  <w:r>
+                                    <w:rPr>
+                                      <w:b/>
+                                      <w:spacing w:val="-4"/>
+                                      <w:sz w:val="19"/>
+                                      <w:u w:val="single"/>
+                                    </w:rPr>
+                                    <w:t xml:space="preserve"> </w:t>
+                                  </w:r>
+                                  <w:r>
+                                    <w:rPr>
+                                      <w:b/>
+                                      <w:sz w:val="19"/>
+                                      <w:u w:val="single"/>
+                                    </w:rPr>
+                                    <w:t>Islami,</w:t>
+                                  </w:r>
+                                  <w:r>
+                                    <w:rPr>
+                                      <w:b/>
+                                      <w:spacing w:val="-5"/>
+                                      <w:sz w:val="19"/>
+                                      <w:u w:val="single"/>
+                                    </w:rPr>
+                                    <w:t xml:space="preserve"> M.H</w:t>
+                                  </w:r>
+                                </w:p>
+                              </w:tc>
+                            </w:tr>
+                            <w:tr>
+                              <w:trPr>
+                                <w:trHeight w:val="229"/>
+                              </w:trPr>
+                              <w:tc>
+                                <w:tcPr>
+                                  <w:tcW w:w="2069" w:type="dxa"/>
+                                </w:tcPr>
+                                <w:p>
+                                  <w:pPr>
+                                    <w:pStyle w:val="TableParagraph"/>
+                                    <w:spacing w:before="11" w:line="198" w:lineRule="exact"/>
+                                    <w:ind w:left="2"/>
+                                    <w:rPr>
+                                      <w:b/>
+                                      <w:sz w:val="19"/>
+                                    </w:rPr>
+                                  </w:pPr>
+                                  <w:r>
+                                    <w:rPr>
+                                      <w:b/>
+                                      <w:spacing w:val="-2"/>
+                                      <w:sz w:val="19"/>
+                                    </w:rPr>
+                                    <w:t>Komisaris</w:t>
+                                  </w:r>
+                                </w:p>
+                              </w:tc>
+                            </w:tr>
+                          </w:tbl>
+                          <w:p>
+                            <w:pPr>
+                              <w:pStyle w:val="BodyText"/>
+                              <w:rPr>
+                                <w:b/>
+                              </w:rPr>
+                            </w:pPr>
+                          </w:p>
+                        </w:txbxContent>
+                      </wps:txbx>
+                      <wps:bodyPr wrap="square" lIns="0" tIns="0" rIns="0" bIns="0" rtlCol="0">
+                        <a:noAutofit/>
+                      </wps:bodyPr>
+                    </wps:wsp>
+                  </a:graphicData>
+                </a:graphic>
+              </wp:anchor>
+            </w:drawing>
+          </mc:Choice>
+          <mc:Fallback>
+            <w:pict>
+              <v:shape w14:anchorId="75020C2C" id="Textbox 1" o:spid="_x0000_s1029" type="#_x0000_t202" style="position:absolute;left:0;text-align:left;margin-left:456.4pt;margin-top:702.6pt;width:109.5pt;height:22.9pt;z-index:-251655168;visibility:visible;mso-wrap-style:square;mso-wrap-distance-left:0;mso-wrap-distance-top:0;mso-wrap-distance-right:0;mso-wrap-distance-bottom:0;mso-position-horizontal:absolute;mso-position-horizontal-relative:page;mso-position-vertical:absolute;mso-position-vertical-relative:page;v-text-anchor:top" o:gfxdata="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" filled="f" stroked="f">
+                <v:textbox inset="0,0,0,0">
+                  <w:txbxContent>
+                    <w:tbl>
+                      <w:tblPr>
+                        <w:tblW w:w="0" w:type="auto"/>
+                        <w:tblInd w:w="67" w:type="dxa"/>
+                        <w:tblLayout w:type="fixed"/>
+                        <w:tblCellMar>
+                          <w:left w:w="0" w:type="dxa"/>
+                          <w:right w:w="0" w:type="dxa"/>
+                        </w:tblCellMar>
+                        <w:tblLook w:val="01E0" w:firstRow="1" w:lastRow="1" w:firstColumn="1" w:lastColumn="1" w:noHBand="0" w:noVBand="0"/>
+                      </w:tblPr>
+                      <w:tblGrid>
+                        <w:gridCol w:w="2069"/>
+                      </w:tblGrid>
+                      <w:tr>
+                        <w:trPr>
+                          <w:trHeight w:val="229"/>
+                        </w:trPr>
+                        <w:tc>
+                          <w:tcPr>
+                            <w:tcW w:w="2069" w:type="dxa"/>
+                          </w:tcPr>
+                          <w:p>
+                            <w:pPr>
+                              <w:pStyle w:val="TableParagraph"/>
+                              <w:spacing w:before="0" w:line="210" w:lineRule="exact"/>
+                              <w:ind w:left="2" w:right="2"/>
+                              <w:jc w:val="left"/>
+                              <w:rPr>
+                                <w:b/>
+                                <w:sz w:val="19"/>
+                                <w:u w:val="single"/>
+                              </w:rPr>
+                            </w:pPr>
+                            <w:r>
+                              <w:rPr>
+                                <w:b/>
+                                <w:sz w:val="19"/>
+                                <w:u w:val="single"/>
+                              </w:rPr>
+                              <w:t>Nur</w:t>
+                            </w:r>
+                            <w:r>
+                              <w:rPr>
+                                <w:b/>
+                                <w:spacing w:val="-7"/>
+                                <w:sz w:val="19"/>
+                                <w:u w:val="single"/>
+                              </w:rPr>
+                              <w:t xml:space="preserve"> </w:t>
+                            </w:r>
+                            <w:r>
+                              <w:rPr>
+                                <w:b/>
+                                <w:sz w:val="19"/>
+                                <w:u w:val="single"/>
+                              </w:rPr>
+                              <w:t>Annisa</w:t>
+                            </w:r>
+                            <w:r>
+                              <w:rPr>
+                                <w:b/>
+                                <w:spacing w:val="-4"/>
+                                <w:sz w:val="19"/>
+                                <w:u w:val="single"/>
+                              </w:rPr>
+                              <w:t xml:space="preserve"> </w:t>
+                            </w:r>
+                            <w:r>
+                              <w:rPr>
+                                <w:b/>
+                                <w:sz w:val="19"/>
+                                <w:u w:val="single"/>
+                              </w:rPr>
+                              <w:t>Islami,</w:t>
+                            </w:r>
+                            <w:r>
+                              <w:rPr>
+                                <w:b/>
+                                <w:spacing w:val="-5"/>
+                                <w:sz w:val="19"/>
+                                <w:u w:val="single"/>
+                              </w:rPr>
+                              <w:t xml:space="preserve"> M.H</w:t>
+                            </w:r>
+                          </w:p>
+                        </w:tc>
+                      </w:tr>
+                      <w:tr>
+                        <w:trPr>
+                          <w:trHeight w:val="229"/>
+                        </w:trPr>
+                        <w:tc>
+                          <w:tcPr>
+                            <w:tcW w:w="2069" w:type="dxa"/>
+                          </w:tcPr>
+                          <w:p>
+                            <w:pPr>
+                              <w:pStyle w:val="TableParagraph"/>
+                              <w:spacing w:before="11" w:line="198" w:lineRule="exact"/>
+                              <w:ind w:left="2"/>
+                              <w:rPr>
+                                <w:b/>
+                                <w:sz w:val="19"/>
+                              </w:rPr>
+                            </w:pPr>
+                            <w:r>
+                              <w:rPr>
+                                <w:b/>
+                                <w:spacing w:val="-2"/>
+                                <w:sz w:val="19"/>
+                              </w:rPr>
+                              <w:t>Komisaris</w:t>
+                            </w:r>
+                          </w:p>
+                        </w:tc>
+                      </w:tr>
+                    </w:tbl>
+                    <w:p>
+                      <w:pPr>
+                        <w:pStyle w:val="BodyText"/>
+                        <w:rPr>
+                          <w:b/>
+                        </w:rPr>
+                      </w:pPr>
+                    </w:p>
+                  </w:txbxContent>
+                </v:textbox>
+                <w10:wrap type="through" anchorx="page" anchory="page"/>
+              </v:shape>
+            </w:pict>
+          </mc:Fallback>
+        </mc:AlternateContent>
       </w:r>
     </w:p>
     <w:sectPr>
@@ -3150,7 +3586,7 @@
 </file>
 
 <file path=word/endnotes.xml><?xml version="1.0" encoding="utf-8"?>
-<w:endnotes xmlns:wpc="http://schemas.microsoft.com/office/word/2010/wordprocessingCanvas" xmlns:cx="http://schemas.microsoft.com/office/drawing/2014/chartex" xmlns:cx1="http://schemas.microsoft.com/office/drawing/2015/9/8/chartex" xmlns:cx2="http://schemas.microsoft.com/office/drawing/2015/10/21/chartex" xmlns:cx3="http://schemas.microsoft.com/office/drawing/2016/5/9/chartex" xmlns:cx4="http://schemas.microsoft.com/office/drawing/2016/5/10/chartex" xmlns:cx5="http://schemas.microsoft.com/office/drawing/2016/5/11/chartex" xmlns:cx6="http://schemas.microsoft.com/office/drawing/2016/5/12/chartex" xmlns:cx7="http://schemas.microsoft.com/office/drawing/2016/5/13/chartex" xmlns:cx8="http://schemas.microsoft.com/office/drawing/2016/5/14/chartex" xmlns:mc="http://schemas.openxmlformats.org/markup-compatibility/2006" xmlns:aink="http://schemas.microsoft.com/office/drawing/2016/ink" xmlns:am3d="http://schemas.microsoft.com/office/drawing/2017/model3d" xmlns:o="urn:schemas-microsoft-com:office:office" xmlns:oel="http://schemas.microsoft.com/office/2019/extlst" xmlns:r="http://schemas.openxmlformats.org/officeDocument/2006/relationships" xmlns:m="http://schemas.openxmlformats.org/officeDocument/2006/math" xmlns:v="urn:schemas-microsoft-com:vml" xmlns:wp14="http://schemas.microsoft.com/office/word/2010/wordprocessingDrawing" xmlns:wp="http://schemas.openxmlformats.org/drawingml/2006/wordprocessingDrawing" xmlns:w10="urn:schemas-microsoft-com:office:word" xmlns:w="http://schemas.openxmlformats.org/wordprocessingml/2006/main" xmlns:w14="http://schemas.microsoft.com/office/word/2010/wordml" xmlns:w15="http://schemas.microsoft.com/office/word/2012/wordml" xmlns:w16cex="http://schemas.microsoft.com/office/word/2018/wordml/cex" xmlns:w16cid="http://schemas.microsoft.com/office/word/2016/wordml/cid" xmlns:w16="http://schemas.microsoft.com/office/word/2018/wordml" xmlns:w16du="http://schemas.microsoft.com/office/word/2023/wordml/word16du" xmlns:w16sdtdh="http://schemas.microsoft.com/office/word/2020/wordml/sdtdatahash" xmlns:w16sdtfl="http://schemas.microsoft.com/office/word/2024/wordml/sdtformatlock" xmlns:w16se="http://schemas.microsoft.com/office/word/2015/wordml/symex" xmlns:wpg="http://schemas.microsoft.com/office/word/2010/wordprocessingGroup" xmlns:wpi="http://schemas.microsoft.com/office/word/2010/wordprocessingInk" xmlns:wne="http://schemas.microsoft.com/office/word/2006/wordml" xmlns:wps="http://schemas.microsoft.com/office/word/2010/wordprocessingShape" mc:Ignorable="w14 w15 w16se w16cid w16 w16cex w16sdtdh w16sdtfl w16du wp14">
+<w:endnotes xmlns:wpc="http://schemas.microsoft.com/office/word/2010/wordprocessingCanvas" xmlns:cx="http://schemas.microsoft.com/office/drawing/2014/chartex" xmlns:cx1="http://schemas.microsoft.com/office/drawing/2015/9/8/chartex" xmlns:cx2="http://schemas.microsoft.com/office/drawing/2015/10/21/chartex" xmlns:cx3="http://schemas.microsoft.com/office/drawing/2016/5/9/chartex" xmlns:cx4="http://schemas.microsoft.com/office/drawing/2016/5/10/chartex" xmlns:cx5="http://schemas.microsoft.com/office/drawing/2016/5/11/chartex" xmlns:cx6="http://schemas.microsoft.com/office/drawing/2016/5/12/chartex" xmlns:cx7="http://schemas.microsoft.com/office/drawing/2016/5/13/chartex" xmlns:cx8="http://schemas.microsoft.com/office/drawing/2016/5/14/chartex" xmlns:mc="http://schemas.openxmlformats.org/markup-compatibility/2006" xmlns:aink="http://schemas.microsoft.com/office/drawing/2016/ink" xmlns:am3d="http://schemas.microsoft.com/office/drawing/2017/model3d" xmlns:o="urn:schemas-microsoft-com:office:office" xmlns:oel="http://schemas.microsoft.com/office/2019/extlst" xmlns:r="http://schemas.openxmlformats.org/officeDocument/2006/relationships" xmlns:m="http://schemas.openxmlformats.org/officeDocument/2006/math" xmlns:v="urn:schemas-microsoft-com:vml" xmlns:wp14="http://schemas.microsoft.com/office/word/2010/wordprocessingDrawing" xmlns:wp="http://schemas.openxmlformats.org/drawingml/2006/wordprocessingDrawing" xmlns:w10="urn:schemas-microsoft-com:office:word" xmlns:w="http://schemas.openxmlformats.org/wordprocessingml/2006/main" xmlns:w14="http://schemas.microsoft.com/office/word/2010/wordml" xmlns:w15="http://schemas.microsoft.com/office/word/2012/wordml" xmlns:w16cei="http://schemas.microsoft.com/office/word/2026/wordml/cei" xmlns:w16cex="http://schemas.microsoft.com/office/word/2018/wordml/cex" xmlns:w16cid="http://schemas.microsoft.com/office/word/2016/wordml/cid" xmlns:w16="http://schemas.microsoft.com/office/word/2018/wordml" xmlns:w16du="http://schemas.microsoft.com/office/word/2023/wordml/word16du" xmlns:w16sdtdh="http://schemas.microsoft.com/office/word/2020/wordml/sdtdatahash" xmlns:w16sdtfl="http://schemas.microsoft.com/office/word/2024/wordml/sdtformatlock" xmlns:w16se="http://schemas.microsoft.com/office/word/2015/wordml/symex" xmlns:wpg="http://schemas.microsoft.com/office/word/2010/wordprocessingGroup" xmlns:wpi="http://schemas.microsoft.com/office/word/2010/wordprocessingInk" xmlns:wne="http://schemas.microsoft.com/office/word/2006/wordml" xmlns:wps="http://schemas.microsoft.com/office/word/2010/wordprocessingShape" mc:Ignorable="w14 w15 w16se w16cid w16 w16cex w16sdtdh w16sdtfl w16du wp14">
   <w:endnote w:type="separator" w:id="-1">
     <w:p>
       <w:r>
@@ -3169,7 +3605,7 @@
 </file>
 
 <file path=word/footer1.xml><?xml version="1.0" encoding="utf-8"?>
-<w:ftr xmlns:wpc="http://schemas.microsoft.com/office/word/2010/wordprocessingCanvas" xmlns:cx="http://schemas.microsoft.com/office/drawing/2014/chartex" xmlns:cx1="http://schemas.microsoft.com/office/drawing/2015/9/8/chartex" xmlns:cx2="http://schemas.microsoft.com/office/drawing/2015/10/21/chartex" xmlns:cx3="http://schemas.microsoft.com/office/drawing/2016/5/9/chartex" xmlns:cx4="http://schemas.microsoft.com/office/drawing/2016/5/10/chartex" xmlns:cx5="http://schemas.microsoft.com/office/drawing/2016/5/11/chartex" xmlns:cx6="http://schemas.microsoft.com/office/drawing/2016/5/12/chartex" xmlns:cx7="http://schemas.microsoft.com/office/drawing/2016/5/13/chartex" xmlns:cx8="http://schemas.microsoft.com/office/drawing/2016/5/14/chartex" xmlns:mc="http://schemas.openxmlformats.org/markup-compatibility/2006" xmlns:aink="http://schemas.microsoft.com/office/drawing/2016/ink" xmlns:am3d="http://schemas.microsoft.com/office/drawing/2017/model3d" xmlns:o="urn:schemas-microsoft-com:office:office" xmlns:oel="http://schemas.microsoft.com/office/2019/extlst" xmlns:r="http://schemas.openxmlformats.org/officeDocument/2006/relationships" xmlns:m="http://schemas.openxmlformats.org/officeDocument/2006/math" xmlns:v="urn:schemas-microsoft-com:vml" xmlns:wp14="http://schemas.microsoft.com/office/word/2010/wordprocessingDrawing" xmlns:wp="http://schemas.openxmlformats.org/drawingml/2006/wordprocessingDrawing" xmlns:w10="urn:schemas-microsoft-com:office:word" xmlns:w="http://schemas.openxmlformats.org/wordprocessingml/2006/main" xmlns:w14="http://schemas.microsoft.com/office/word/2010/wordml" xmlns:w15="http://schemas.microsoft.com/office/word/2012/wordml" xmlns:w16cex="http://schemas.microsoft.com/office/word/2018/wordml/cex" xmlns:w16cid="http://schemas.microsoft.com/office/word/2016/wordml/cid" xmlns:w16="http://schemas.microsoft.com/office/word/2018/wordml" xmlns:w16du="http://schemas.microsoft.com/office/word/2023/wordml/word16du" xmlns:w16sdtdh="http://schemas.microsoft.com/office/word/2020/wordml/sdtdatahash" xmlns:w16sdtfl="http://schemas.microsoft.com/office/word/2024/wordml/sdtformatlock" xmlns:w16se="http://schemas.microsoft.com/office/word/2015/wordml/symex" xmlns:wpg="http://schemas.microsoft.com/office/word/2010/wordprocessingGroup" xmlns:wpi="http://schemas.microsoft.com/office/word/2010/wordprocessingInk" xmlns:wne="http://schemas.microsoft.com/office/word/2006/wordml" xmlns:wps="http://schemas.microsoft.com/office/word/2010/wordprocessingShape" mc:Ignorable="w14 w15 w16se w16cid w16 w16cex w16sdtdh w16sdtfl w16du wp14">
+<w:ftr xmlns:wpc="http://schemas.microsoft.com/office/word/2010/wordprocessingCanvas" xmlns:cx="http://schemas.microsoft.com/office/drawing/2014/chartex" xmlns:cx1="http://schemas.microsoft.com/office/drawing/2015/9/8/chartex" xmlns:cx2="http://schemas.microsoft.com/office/drawing/2015/10/21/chartex" xmlns:cx3="http://schemas.microsoft.com/office/drawing/2016/5/9/chartex" xmlns:cx4="http://schemas.microsoft.com/office/drawing/2016/5/10/chartex" xmlns:cx5="http://schemas.microsoft.com/office/drawing/2016/5/11/chartex" xmlns:cx6="http://schemas.microsoft.com/office/drawing/2016/5/12/chartex" xmlns:cx7="http://schemas.microsoft.com/office/drawing/2016/5/13/chartex" xmlns:cx8="http://schemas.microsoft.com/office/drawing/2016/5/14/chartex" xmlns:mc="http://schemas.openxmlformats.org/markup-compatibility/2006" xmlns:aink="http://schemas.microsoft.com/office/drawing/2016/ink" xmlns:am3d="http://schemas.microsoft.com/office/drawing/2017/model3d" xmlns:o="urn:schemas-microsoft-com:office:office" xmlns:oel="http://schemas.microsoft.com/office/2019/extlst" xmlns:r="http://schemas.openxmlformats.org/officeDocument/2006/relationships" xmlns:m="http://schemas.openxmlformats.org/officeDocument/2006/math" xmlns:v="urn:schemas-microsoft-com:vml" xmlns:wp14="http://schemas.microsoft.com/office/word/2010/wordprocessingDrawing" xmlns:wp="http://schemas.openxmlformats.org/drawingml/2006/wordprocessingDrawing" xmlns:w10="urn:schemas-microsoft-com:office:word" xmlns:w="http://schemas.openxmlformats.org/wordprocessingml/2006/main" xmlns:w14="http://schemas.microsoft.com/office/word/2010/wordml" xmlns:w15="http://schemas.microsoft.com/office/word/2012/wordml" xmlns:w16cei="http://schemas.microsoft.com/office/word/2026/wordml/cei" xmlns:w16cex="http://schemas.microsoft.com/office/word/2018/wordml/cex" xmlns:w16cid="http://schemas.microsoft.com/office/word/2016/wordml/cid" xmlns:w16="http://schemas.microsoft.com/office/word/2018/wordml" xmlns:w16du="http://schemas.microsoft.com/office/word/2023/wordml/word16du" xmlns:w16sdtdh="http://schemas.microsoft.com/office/word/2020/wordml/sdtdatahash" xmlns:w16sdtfl="http://schemas.microsoft.com/office/word/2024/wordml/sdtformatlock" xmlns:w16se="http://schemas.microsoft.com/office/word/2015/wordml/symex" xmlns:wpg="http://schemas.microsoft.com/office/word/2010/wordprocessingGroup" xmlns:wpi="http://schemas.microsoft.com/office/word/2010/wordprocessingInk" xmlns:wne="http://schemas.microsoft.com/office/word/2006/wordml" xmlns:wps="http://schemas.microsoft.com/office/word/2010/wordprocessingShape" mc:Ignorable="w14 w15 w16se w16cid w16 w16cex w16sdtdh w16sdtfl w16du wp14">
   <w:p>
     <w:pPr>
       <w:pStyle w:val="BodyText"/>
@@ -3178,306 +3614,12 @@
         <w:sz w:val="20"/>
       </w:rPr>
     </w:pPr>
-    <w:r>
-      <w:rPr>
-        <w:noProof/>
-        <w:sz w:val="20"/>
-      </w:rPr>
-      <mc:AlternateContent>
-        <mc:Choice Requires="wps">
-          <w:drawing>
-            <wp:anchor distT="0" distB="0" distL="0" distR="0" simplePos="0" relativeHeight="15728640" behindDoc="0" locked="0" layoutInCell="1" allowOverlap="1" wp14:anchorId="30748940" wp14:editId="01C21B45">
-              <wp:simplePos x="0" y="0"/>
-              <wp:positionH relativeFrom="page">
-                <wp:posOffset>5658611</wp:posOffset>
-              </wp:positionH>
-              <wp:positionV relativeFrom="page">
-                <wp:posOffset>8920254</wp:posOffset>
-              </wp:positionV>
-              <wp:extent cx="1390650" cy="290830"/>
-              <wp:effectExtent l="0" t="0" r="0" b="0"/>
-              <wp:wrapNone/>
-              <wp:docPr id="1" name="Textbox 1"/>
-              <wp:cNvGraphicFramePr>
-                <a:graphicFrameLocks xmlns:a="http://schemas.openxmlformats.org/drawingml/2006/main"/>
-              </wp:cNvGraphicFramePr>
-              <a:graphic xmlns:a="http://schemas.openxmlformats.org/drawingml/2006/main">
-                <a:graphicData uri="http://schemas.microsoft.com/office/word/2010/wordprocessingShape">
-                  <wps:wsp>
-                    <wps:cNvSpPr txBox="1">
-                      <a:spLocks/>
-                    </wps:cNvSpPr>
-                    <wps:spPr>
-                      <a:xfrm>
-                        <a:off x="0" y="0"/>
-                        <a:ext cx="1390650" cy="290830"/>
-                      </a:xfrm>
-                      <a:prstGeom prst="rect">
-                        <a:avLst/>
-                      </a:prstGeom>
-                    </wps:spPr>
-                    <wps:txbx>
-                      <w:txbxContent>
-                        <w:tbl>
-                          <w:tblPr>
-                            <w:tblW w:w="0" w:type="auto"/>
-                            <w:tblInd w:w="67" w:type="dxa"/>
-                            <w:tblLayout w:type="fixed"/>
-                            <w:tblCellMar>
-                              <w:left w:w="0" w:type="dxa"/>
-                              <w:right w:w="0" w:type="dxa"/>
-                            </w:tblCellMar>
-                            <w:tblLook w:val="01E0" w:firstRow="1" w:lastRow="1" w:firstColumn="1" w:lastColumn="1" w:noHBand="0" w:noVBand="0"/>
-                          </w:tblPr>
-                          <w:tblGrid>
-                            <w:gridCol w:w="2069"/>
-                          </w:tblGrid>
-                          <w:tr>
-                            <w:trPr>
-                              <w:trHeight w:val="229"/>
-                            </w:trPr>
-                            <w:tc>
-                              <w:tcPr>
-                                <w:tcW w:w="2069" w:type="dxa"/>
-                              </w:tcPr>
-                              <w:p>
-                                <w:pPr>
-                                  <w:pStyle w:val="TableParagraph"/>
-                                  <w:spacing w:before="0" w:line="210" w:lineRule="exact"/>
-                                  <w:ind w:left="2" w:right="2"/>
-                                  <w:rPr>
-                                    <w:b/>
-                                    <w:sz w:val="19"/>
-                                  </w:rPr>
-                                </w:pPr>
-                                <w:r>
-                                  <w:rPr>
-                                    <w:b/>
-                                    <w:sz w:val="19"/>
-                                  </w:rPr>
-                                  <w:t>Nur</w:t>
-                                </w:r>
-                                <w:r>
-                                  <w:rPr>
-                                    <w:b/>
-                                    <w:spacing w:val="-7"/>
-                                    <w:sz w:val="19"/>
-                                  </w:rPr>
-                                  <w:t xml:space="preserve"> </w:t>
-                                </w:r>
-                                <w:r>
-                                  <w:rPr>
-                                    <w:b/>
-                                    <w:sz w:val="19"/>
-                                  </w:rPr>
-                                  <w:t>Annisa</w:t>
-                                </w:r>
-                                <w:r>
-                                  <w:rPr>
-                                    <w:b/>
-                                    <w:spacing w:val="-4"/>
-                                    <w:sz w:val="19"/>
-                                  </w:rPr>
-                                  <w:t xml:space="preserve"> </w:t>
-                                </w:r>
-                                <w:r>
-                                  <w:rPr>
-                                    <w:b/>
-                                    <w:sz w:val="19"/>
-                                  </w:rPr>
-                                  <w:t>Islami,</w:t>
-                                </w:r>
-                                <w:r>
-                                  <w:rPr>
-                                    <w:b/>
-                                    <w:spacing w:val="-5"/>
-                                    <w:sz w:val="19"/>
-                                  </w:rPr>
-                                  <w:t xml:space="preserve"> M.H</w:t>
-                                </w:r>
-                              </w:p>
-                            </w:tc>
-                          </w:tr>
-                          <w:tr>
-                            <w:trPr>
-                              <w:trHeight w:val="229"/>
-                            </w:trPr>
-                            <w:tc>
-                              <w:tcPr>
-                                <w:tcW w:w="2069" w:type="dxa"/>
-                              </w:tcPr>
-                              <w:p>
-                                <w:pPr>
-                                  <w:pStyle w:val="TableParagraph"/>
-                                  <w:spacing w:before="11" w:line="198" w:lineRule="exact"/>
-                                  <w:ind w:left="2"/>
-                                  <w:rPr>
-                                    <w:sz w:val="19"/>
-                                  </w:rPr>
-                                </w:pPr>
-                                <w:r>
-                                  <w:rPr>
-                                    <w:spacing w:val="-2"/>
-                                    <w:sz w:val="19"/>
-                                  </w:rPr>
-                                  <w:t>Komisaris</w:t>
-                                </w:r>
-                              </w:p>
-                            </w:tc>
-                          </w:tr>
-                        </w:tbl>
-                        <w:p>
-                          <w:pPr>
-                            <w:pStyle w:val="BodyText"/>
-                          </w:pPr>
-                        </w:p>
-                      </w:txbxContent>
-                    </wps:txbx>
-                    <wps:bodyPr wrap="square" lIns="0" tIns="0" rIns="0" bIns="0" rtlCol="0">
-                      <a:noAutofit/>
-                    </wps:bodyPr>
-                  </wps:wsp>
-                </a:graphicData>
-              </a:graphic>
-            </wp:anchor>
-          </w:drawing>
-        </mc:Choice>
-        <mc:Fallback>
-          <w:pict>
-            <v:shapetype w14:anchorId="30748940" id="_x0000_t202" coordsize="21600,21600" o:spt="202" path="m,l,21600r21600,l21600,xe">
-              <v:stroke joinstyle="miter"/>
-              <v:path gradientshapeok="t" o:connecttype="rect"/>
-            </v:shapetype>
-            <v:shape id="Textbox 1" o:spid="_x0000_s1029" type="#_x0000_t202" style="position:absolute;margin-left:445.55pt;margin-top:702.4pt;width:109.5pt;height:22.9pt;z-index:15728640;visibility:visible;mso-wrap-style:square;mso-wrap-distance-left:0;mso-wrap-distance-top:0;mso-wrap-distance-right:0;mso-wrap-distance-bottom:0;mso-position-horizontal:absolute;mso-position-horizontal-relative:page;mso-position-vertical:absolute;mso-position-vertical-relative:page;v-text-anchor:top" o:gfxdata="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" filled="f" stroked="f">
-              <v:textbox inset="0,0,0,0">
-                <w:txbxContent>
-                  <w:tbl>
-                    <w:tblPr>
-                      <w:tblW w:w="0" w:type="auto"/>
-                      <w:tblInd w:w="67" w:type="dxa"/>
-                      <w:tblLayout w:type="fixed"/>
-                      <w:tblCellMar>
-                        <w:left w:w="0" w:type="dxa"/>
-                        <w:right w:w="0" w:type="dxa"/>
-                      </w:tblCellMar>
-                      <w:tblLook w:val="01E0" w:firstRow="1" w:lastRow="1" w:firstColumn="1" w:lastColumn="1" w:noHBand="0" w:noVBand="0"/>
-                    </w:tblPr>
-                    <w:tblGrid>
-                      <w:gridCol w:w="2069"/>
-                    </w:tblGrid>
-                    <w:tr>
-                      <w:trPr>
-                        <w:trHeight w:val="229"/>
-                      </w:trPr>
-                      <w:tc>
-                        <w:tcPr>
-                          <w:tcW w:w="2069" w:type="dxa"/>
-                        </w:tcPr>
-                        <w:p>
-                          <w:pPr>
-                            <w:pStyle w:val="TableParagraph"/>
-                            <w:spacing w:before="0" w:line="210" w:lineRule="exact"/>
-                            <w:ind w:left="2" w:right="2"/>
-                            <w:rPr>
-                              <w:b/>
-                              <w:sz w:val="19"/>
-                            </w:rPr>
-                          </w:pPr>
-                          <w:r>
-                            <w:rPr>
-                              <w:b/>
-                              <w:sz w:val="19"/>
-                            </w:rPr>
-                            <w:t>Nur</w:t>
-                          </w:r>
-                          <w:r>
-                            <w:rPr>
-                              <w:b/>
-                              <w:spacing w:val="-7"/>
-                              <w:sz w:val="19"/>
-                            </w:rPr>
-                            <w:t xml:space="preserve"> </w:t>
-                          </w:r>
-                          <w:r>
-                            <w:rPr>
-                              <w:b/>
-                              <w:sz w:val="19"/>
-                            </w:rPr>
-                            <w:t>Annisa</w:t>
-                          </w:r>
-                          <w:r>
-                            <w:rPr>
-                              <w:b/>
-                              <w:spacing w:val="-4"/>
-                              <w:sz w:val="19"/>
-                            </w:rPr>
-                            <w:t xml:space="preserve"> </w:t>
-                          </w:r>
-                          <w:r>
-                            <w:rPr>
-                              <w:b/>
-                              <w:sz w:val="19"/>
-                            </w:rPr>
-                            <w:t>Islami,</w:t>
-                          </w:r>
-                          <w:r>
-                            <w:rPr>
-                              <w:b/>
-                              <w:spacing w:val="-5"/>
-                              <w:sz w:val="19"/>
-                            </w:rPr>
-                            <w:t xml:space="preserve"> M.H</w:t>
-                          </w:r>
-                        </w:p>
-                      </w:tc>
-                    </w:tr>
-                    <w:tr>
-                      <w:trPr>
-                        <w:trHeight w:val="229"/>
-                      </w:trPr>
-                      <w:tc>
-                        <w:tcPr>
-                          <w:tcW w:w="2069" w:type="dxa"/>
-                        </w:tcPr>
-                        <w:p>
-                          <w:pPr>
-                            <w:pStyle w:val="TableParagraph"/>
-                            <w:spacing w:before="11" w:line="198" w:lineRule="exact"/>
-                            <w:ind w:left="2"/>
-                            <w:rPr>
-                              <w:sz w:val="19"/>
-                            </w:rPr>
-                          </w:pPr>
-                          <w:r>
-                            <w:rPr>
-                              <w:spacing w:val="-2"/>
-                              <w:sz w:val="19"/>
-                            </w:rPr>
-                            <w:t>Komisaris</w:t>
-                          </w:r>
-                        </w:p>
-                      </w:tc>
-                    </w:tr>
-                  </w:tbl>
-                  <w:p>
-                    <w:pPr>
-                      <w:pStyle w:val="BodyText"/>
-                    </w:pPr>
-                  </w:p>
-                </w:txbxContent>
-              </v:textbox>
-              <w10:wrap anchorx="page" anchory="page"/>
-            </v:shape>
-          </w:pict>
-        </mc:Fallback>
-      </mc:AlternateContent>
-    </w:r>
   </w:p>
 </w:ftr>
 </file>
 
 <file path=word/footnotes.xml><?xml version="1.0" encoding="utf-8"?>
-<w:footnotes xmlns:wpc="http://schemas.microsoft.com/office/word/2010/wordprocessingCanvas" xmlns:cx="http://schemas.microsoft.com/office/drawing/2014/chartex" xmlns:cx1="http://schemas.microsoft.com/office/drawing/2015/9/8/chartex" xmlns:cx2="http://schemas.microsoft.com/office/drawing/2015/10/21/chartex" xmlns:cx3="http://schemas.microsoft.com/office/drawing/2016/5/9/chartex" xmlns:cx4="http://schemas.microsoft.com/office/drawing/2016/5/10/chartex" xmlns:cx5="http://schemas.microsoft.com/office/drawing/2016/5/11/chartex" xmlns:cx6="http://schemas.microsoft.com/office/drawing/2016/5/12/chartex" xmlns:cx7="http://schemas.microsoft.com/office/drawing/2016/5/13/chartex" xmlns:cx8="http://schemas.microsoft.com/office/drawing/2016/5/14/chartex" xmlns:mc="http://schemas.openxmlformats.org/markup-compatibility/2006" xmlns:aink="http://schemas.microsoft.com/office/drawing/2016/ink" xmlns:am3d="http://schemas.microsoft.com/office/drawing/2017/model3d" xmlns:o="urn:schemas-microsoft-com:office:office" xmlns:oel="http://schemas.microsoft.com/office/2019/extlst" xmlns:r="http://schemas.openxmlformats.org/officeDocument/2006/relationships" xmlns:m="http://schemas.openxmlformats.org/officeDocument/2006/math" xmlns:v="urn:schemas-microsoft-com:vml" xmlns:wp14="http://schemas.microsoft.com/office/word/2010/wordprocessingDrawing" xmlns:wp="http://schemas.openxmlformats.org/drawingml/2006/wordprocessingDrawing" xmlns:w10="urn:schemas-microsoft-com:office:word" xmlns:w="http://schemas.openxmlformats.org/wordprocessingml/2006/main" xmlns:w14="http://schemas.microsoft.com/office/word/2010/wordml" xmlns:w15="http://schemas.microsoft.com/office/word/2012/wordml" xmlns:w16cex="http://schemas.microsoft.com/office/word/2018/wordml/cex" xmlns:w16cid="http://schemas.microsoft.com/office/word/2016/wordml/cid" xmlns:w16="http://schemas.microsoft.com/office/word/2018/wordml" xmlns:w16du="http://schemas.microsoft.com/office/word/2023/wordml/word16du" xmlns:w16sdtdh="http://schemas.microsoft.com/office/word/2020/wordml/sdtdatahash" xmlns:w16sdtfl="http://schemas.microsoft.com/office/word/2024/wordml/sdtformatlock" xmlns:w16se="http://schemas.microsoft.com/office/word/2015/wordml/symex" xmlns:wpg="http://schemas.microsoft.com/office/word/2010/wordprocessingGroup" xmlns:wpi="http://schemas.microsoft.com/office/word/2010/wordprocessingInk" xmlns:wne="http://schemas.microsoft.com/office/word/2006/wordml" xmlns:wps="http://schemas.microsoft.com/office/word/2010/wordprocessingShape" mc:Ignorable="w14 w15 w16se w16cid w16 w16cex w16sdtdh w16sdtfl w16du wp14">
+<w:footnotes xmlns:wpc="http://schemas.microsoft.com/office/word/2010/wordprocessingCanvas" xmlns:cx="http://schemas.microsoft.com/office/drawing/2014/chartex" xmlns:cx1="http://schemas.microsoft.com/office/drawing/2015/9/8/chartex" xmlns:cx2="http://schemas.microsoft.com/office/drawing/2015/10/21/chartex" xmlns:cx3="http://schemas.microsoft.com/office/drawing/2016/5/9/chartex" xmlns:cx4="http://schemas.microsoft.com/office/drawing/2016/5/10/chartex" xmlns:cx5="http://schemas.microsoft.com/office/drawing/2016/5/11/chartex" xmlns:cx6="http://schemas.microsoft.com/office/drawing/2016/5/12/chartex" xmlns:cx7="http://schemas.microsoft.com/office/drawing/2016/5/13/chartex" xmlns:cx8="http://schemas.microsoft.com/office/drawing/2016/5/14/chartex" xmlns:mc="http://schemas.openxmlformats.org/markup-compatibility/2006" xmlns:aink="http://schemas.microsoft.com/office/drawing/2016/ink" xmlns:am3d="http://schemas.microsoft.com/office/drawing/2017/model3d" xmlns:o="urn:schemas-microsoft-com:office:office" xmlns:oel="http://schemas.microsoft.com/office/2019/extlst" xmlns:r="http://schemas.openxmlformats.org/officeDocument/2006/relationships" xmlns:m="http://schemas.openxmlformats.org/officeDocument/2006/math" xmlns:v="urn:schemas-microsoft-com:vml" xmlns:wp14="http://schemas.microsoft.com/office/word/2010/wordprocessingDrawing" xmlns:wp="http://schemas.openxmlformats.org/drawingml/2006/wordprocessingDrawing" xmlns:w10="urn:schemas-microsoft-com:office:word" xmlns:w="http://schemas.openxmlformats.org/wordprocessingml/2006/main" xmlns:w14="http://schemas.microsoft.com/office/word/2010/wordml" xmlns:w15="http://schemas.microsoft.com/office/word/2012/wordml" xmlns:w16cei="http://schemas.microsoft.com/office/word/2026/wordml/cei" xmlns:w16cex="http://schemas.microsoft.com/office/word/2018/wordml/cex" xmlns:w16cid="http://schemas.microsoft.com/office/word/2016/wordml/cid" xmlns:w16="http://schemas.microsoft.com/office/word/2018/wordml" xmlns:w16du="http://schemas.microsoft.com/office/word/2023/wordml/word16du" xmlns:w16sdtdh="http://schemas.microsoft.com/office/word/2020/wordml/sdtdatahash" xmlns:w16sdtfl="http://schemas.microsoft.com/office/word/2024/wordml/sdtformatlock" xmlns:w16se="http://schemas.microsoft.com/office/word/2015/wordml/symex" xmlns:wpg="http://schemas.microsoft.com/office/word/2010/wordprocessingGroup" xmlns:wpi="http://schemas.microsoft.com/office/word/2010/wordprocessingInk" xmlns:wne="http://schemas.microsoft.com/office/word/2006/wordml" xmlns:wps="http://schemas.microsoft.com/office/word/2010/wordprocessingShape" mc:Ignorable="w14 w15 w16se w16cid w16 w16cex w16sdtdh w16sdtfl w16du wp14">
   <w:footnote w:type="separator" w:id="-1">
     <w:p>
       <w:r>
@@ -3903,7 +4045,6 @@
   <w:style w:type="character" w:default="1" w:styleId="DefaultParagraphFont">
     <w:name w:val="Default Paragraph Font"/>
     <w:uiPriority w:val="1"/>
-    <w:semiHidden/>
     <w:unhideWhenUsed/>
   </w:style>
   <w:style w:type="table" w:default="1" w:styleId="TableNormal">
@@ -3930,6 +4071,7 @@
   <w:style w:type="paragraph" w:styleId="BodyText">
     <w:name w:val="Body Text"/>
     <w:basedOn w:val="Normal"/>
+    <w:link w:val="BodyTextChar"/>
     <w:uiPriority w:val="1"/>
     <w:qFormat/>
     <w:rPr>
@@ -4000,6 +4142,19 @@
     <w:rsid w:val="00AC326A"/>
     <w:rPr>
       <w:rFonts w:ascii="Times New Roman" w:eastAsia="Times New Roman" w:hAnsi="Times New Roman" w:cs="Times New Roman"/>
+      <w:lang w:val="ms"/>
+    </w:rPr>
+  </w:style>
+  <w:style w:type="character" w:customStyle="1" w:styleId="BodyTextChar">
+    <w:name w:val="Body Text Char"/>
+    <w:basedOn w:val="DefaultParagraphFont"/>
+    <w:link w:val="BodyText"/>
+    <w:uiPriority w:val="1"/>
+    <w:rsid w:val="006F248D"/>
+    <w:rPr>
+      <w:rFonts w:ascii="Times New Roman" w:eastAsia="Times New Roman" w:hAnsi="Times New Roman" w:cs="Times New Roman"/>
+      <w:sz w:val="19"/>
+      <w:szCs w:val="19"/>
       <w:lang w:val="ms"/>
     </w:rPr>
   </w:style>

</xml_diff>